<commit_message>
Add file structure and MongoDB Compass database screenshots to report
</commit_message>
<xml_diff>
--- a/Parth_Sharma_MERN_Day13_Report.docx
+++ b/Parth_Sharma_MERN_Day13_Report.docx
@@ -322,7 +322,7 @@
               <a:graphicData uri="http://schemas.openxmlformats.org/drawingml/2006/picture">
                 <pic:pic>
                   <pic:nvPicPr>
-                    <pic:cNvPr id="0" name="day13_shopping_cart_checkout_1781525841608.png"/>
+                    <pic:cNvPr id="0" name="day13_shopping_cart_checkout.png"/>
                     <pic:cNvPicPr/>
                   </pic:nvPicPr>
                   <pic:blipFill>
@@ -355,6 +355,140 @@
           <w:sz w:val="20"/>
         </w:rPr>
         <w:t>Figure 13.1: Premium Responsive Cart and Checkout Interface Mockup</w:t>
+      </w:r>
+    </w:p>
+    <w:p>
+      <w:r>
+        <w:br w:type="page"/>
+      </w:r>
+    </w:p>
+    <w:p>
+      <w:r>
+        <w:rPr>
+          <w:rFonts w:ascii="Arial" w:hAnsi="Arial"/>
+          <w:b/>
+          <w:color w:val="6B46C1"/>
+          <w:sz w:val="32"/>
+        </w:rPr>
+        <w:t>PROJECT DIRECTORY &amp; CODE STRUCTURE</w:t>
+      </w:r>
+    </w:p>
+    <w:p>
+      <w:pPr>
+        <w:jc w:val="center"/>
+      </w:pPr>
+      <w:r>
+        <w:drawing>
+          <wp:inline xmlns:a="http://schemas.openxmlformats.org/drawingml/2006/main" xmlns:pic="http://schemas.openxmlformats.org/drawingml/2006/picture">
+            <wp:extent cx="5029200" cy="5029200"/>
+            <wp:docPr id="2" name="Picture 2"/>
+            <wp:cNvGraphicFramePr>
+              <a:graphicFrameLocks noChangeAspect="1"/>
+            </wp:cNvGraphicFramePr>
+            <a:graphic>
+              <a:graphicData uri="http://schemas.openxmlformats.org/drawingml/2006/picture">
+                <pic:pic>
+                  <pic:nvPicPr>
+                    <pic:cNvPr id="0" name="day13_file_structure_code.png"/>
+                    <pic:cNvPicPr/>
+                  </pic:nvPicPr>
+                  <pic:blipFill>
+                    <a:blip r:embed="rId10"/>
+                    <a:stretch>
+                      <a:fillRect/>
+                    </a:stretch>
+                  </pic:blipFill>
+                  <pic:spPr>
+                    <a:xfrm>
+                      <a:off x="0" y="0"/>
+                      <a:ext cx="5029200" cy="5029200"/>
+                    </a:xfrm>
+                    <a:prstGeom prst="rect"/>
+                  </pic:spPr>
+                </pic:pic>
+              </a:graphicData>
+            </a:graphic>
+          </wp:inline>
+        </w:drawing>
+      </w:r>
+    </w:p>
+    <w:p>
+      <w:pPr>
+        <w:jc w:val="center"/>
+      </w:pPr>
+      <w:r>
+        <w:rPr>
+          <w:i/>
+          <w:sz w:val="20"/>
+        </w:rPr>
+        <w:t>Figure 13.2: VS Code Workspace - Code Structure &amp; Backend Controller Server</w:t>
+      </w:r>
+    </w:p>
+    <w:p>
+      <w:r>
+        <w:br w:type="page"/>
+      </w:r>
+    </w:p>
+    <w:p>
+      <w:r>
+        <w:rPr>
+          <w:rFonts w:ascii="Arial" w:hAnsi="Arial"/>
+          <w:b/>
+          <w:color w:val="6B46C1"/>
+          <w:sz w:val="32"/>
+        </w:rPr>
+        <w:t>MONGODB DATABASE PERSISTENCE</w:t>
+      </w:r>
+    </w:p>
+    <w:p>
+      <w:pPr>
+        <w:jc w:val="center"/>
+      </w:pPr>
+      <w:r>
+        <w:drawing>
+          <wp:inline xmlns:a="http://schemas.openxmlformats.org/drawingml/2006/main" xmlns:pic="http://schemas.openxmlformats.org/drawingml/2006/picture">
+            <wp:extent cx="5029200" cy="5029200"/>
+            <wp:docPr id="3" name="Picture 3"/>
+            <wp:cNvGraphicFramePr>
+              <a:graphicFrameLocks noChangeAspect="1"/>
+            </wp:cNvGraphicFramePr>
+            <a:graphic>
+              <a:graphicData uri="http://schemas.openxmlformats.org/drawingml/2006/picture">
+                <pic:pic>
+                  <pic:nvPicPr>
+                    <pic:cNvPr id="0" name="day13_mongodb_compass_cart.png"/>
+                    <pic:cNvPicPr/>
+                  </pic:nvPicPr>
+                  <pic:blipFill>
+                    <a:blip r:embed="rId11"/>
+                    <a:stretch>
+                      <a:fillRect/>
+                    </a:stretch>
+                  </pic:blipFill>
+                  <pic:spPr>
+                    <a:xfrm>
+                      <a:off x="0" y="0"/>
+                      <a:ext cx="5029200" cy="5029200"/>
+                    </a:xfrm>
+                    <a:prstGeom prst="rect"/>
+                  </pic:spPr>
+                </pic:pic>
+              </a:graphicData>
+            </a:graphic>
+          </wp:inline>
+        </w:drawing>
+      </w:r>
+    </w:p>
+    <w:p>
+      <w:pPr>
+        <w:jc w:val="center"/>
+      </w:pPr>
+      <w:r>
+        <w:rPr>
+          <w:i/>
+          <w:sz w:val="20"/>
+        </w:rPr>
+        <w:t>Figure 13.3: MongoDB Compass - Document entries inside the Carts Collection</w:t>
       </w:r>
     </w:p>
     <w:p>

</xml_diff>